<commit_message>
Implement ASGI middleware for Antigravity IDE POST compatibility
</commit_message>
<xml_diff>
--- a/documentacion.docx
+++ b/documentacion.docx
@@ -148,6 +148,383 @@
         <w:rPr>
           <w:noProof/>
         </w:rPr>
+        <mc:AlternateContent>
+          <mc:Choice Requires="wpi">
+            <w:drawing>
+              <wp:anchor distT="0" distB="0" distL="114300" distR="114300" simplePos="0" relativeHeight="251665408" behindDoc="0" locked="0" layoutInCell="1" allowOverlap="1" wp14:anchorId="7058AF37" wp14:editId="4CEB666E">
+                <wp:simplePos x="0" y="0"/>
+                <wp:positionH relativeFrom="column">
+                  <wp:posOffset>2808429</wp:posOffset>
+                </wp:positionH>
+                <wp:positionV relativeFrom="paragraph">
+                  <wp:posOffset>1392419</wp:posOffset>
+                </wp:positionV>
+                <wp:extent cx="173880" cy="429840"/>
+                <wp:effectExtent l="95250" t="152400" r="93345" b="161290"/>
+                <wp:wrapNone/>
+                <wp:docPr id="1407808443" name="Entrada de lápiz 7"/>
+                <wp:cNvGraphicFramePr/>
+                <a:graphic xmlns:a="http://schemas.openxmlformats.org/drawingml/2006/main">
+                  <a:graphicData uri="http://schemas.microsoft.com/office/word/2010/wordprocessingInk">
+                    <w14:contentPart bwMode="auto" r:id="rId9">
+                      <w14:nvContentPartPr>
+                        <w14:cNvContentPartPr/>
+                      </w14:nvContentPartPr>
+                      <w14:xfrm>
+                        <a:off x="0" y="0"/>
+                        <a:ext cx="173880" cy="429840"/>
+                      </w14:xfrm>
+                    </w14:contentPart>
+                  </a:graphicData>
+                </a:graphic>
+              </wp:anchor>
+            </w:drawing>
+          </mc:Choice>
+          <mc:Fallback>
+            <w:pict>
+              <v:shapetype w14:anchorId="37C543C7" id="_x0000_t75" coordsize="21600,21600" o:spt="75" o:preferrelative="t" path="m@4@5l@4@11@9@11@9@5xe" filled="f" stroked="f">
+                <v:stroke joinstyle="miter"/>
+                <v:formulas>
+                  <v:f eqn="if lineDrawn pixelLineWidth 0"/>
+                  <v:f eqn="sum @0 1 0"/>
+                  <v:f eqn="sum 0 0 @1"/>
+                  <v:f eqn="prod @2 1 2"/>
+                  <v:f eqn="prod @3 21600 pixelWidth"/>
+                  <v:f eqn="prod @3 21600 pixelHeight"/>
+                  <v:f eqn="sum @0 0 1"/>
+                  <v:f eqn="prod @6 1 2"/>
+                  <v:f eqn="prod @7 21600 pixelWidth"/>
+                  <v:f eqn="sum @8 21600 0"/>
+                  <v:f eqn="prod @7 21600 pixelHeight"/>
+                  <v:f eqn="sum @10 21600 0"/>
+                </v:formulas>
+                <v:path o:extrusionok="f" gradientshapeok="t" o:connecttype="rect"/>
+                <o:lock v:ext="edit" aspectratio="t"/>
+              </v:shapetype>
+              <v:shape id="Entrada de lápiz 7" o:spid="_x0000_s1026" type="#_x0000_t75" style="position:absolute;margin-left:216.9pt;margin-top:101.15pt;width:22.2pt;height:50.9pt;z-index:251665408;visibility:visible;mso-wrap-style:square;mso-wrap-distance-left:9pt;mso-wrap-distance-top:0;mso-wrap-distance-right:9pt;mso-wrap-distance-bottom:0;mso-position-horizontal:absolute;mso-position-horizontal-relative:text;mso-position-vertical:absolute;mso-position-vertical-relative:text" o:gfxdata="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">
+                <v:imagedata r:id="rId10" o:title=""/>
+              </v:shape>
+            </w:pict>
+          </mc:Fallback>
+        </mc:AlternateContent>
+      </w:r>
+      <w:r>
+        <w:rPr>
+          <w:noProof/>
+        </w:rPr>
+        <mc:AlternateContent>
+          <mc:Choice Requires="wpi">
+            <w:drawing>
+              <wp:anchor distT="0" distB="0" distL="114300" distR="114300" simplePos="0" relativeHeight="251664384" behindDoc="0" locked="0" layoutInCell="1" allowOverlap="1" wp14:anchorId="73C94008" wp14:editId="5FEA396A">
+                <wp:simplePos x="0" y="0"/>
+                <wp:positionH relativeFrom="column">
+                  <wp:posOffset>1075029</wp:posOffset>
+                </wp:positionH>
+                <wp:positionV relativeFrom="paragraph">
+                  <wp:posOffset>536699</wp:posOffset>
+                </wp:positionV>
+                <wp:extent cx="948600" cy="659520"/>
+                <wp:effectExtent l="95250" t="152400" r="99695" b="160020"/>
+                <wp:wrapNone/>
+                <wp:docPr id="1718474624" name="Entrada de lápiz 6"/>
+                <wp:cNvGraphicFramePr/>
+                <a:graphic xmlns:a="http://schemas.openxmlformats.org/drawingml/2006/main">
+                  <a:graphicData uri="http://schemas.microsoft.com/office/word/2010/wordprocessingInk">
+                    <w14:contentPart bwMode="auto" r:id="rId11">
+                      <w14:nvContentPartPr>
+                        <w14:cNvContentPartPr/>
+                      </w14:nvContentPartPr>
+                      <w14:xfrm>
+                        <a:off x="0" y="0"/>
+                        <a:ext cx="948600" cy="659520"/>
+                      </w14:xfrm>
+                    </w14:contentPart>
+                  </a:graphicData>
+                </a:graphic>
+              </wp:anchor>
+            </w:drawing>
+          </mc:Choice>
+          <mc:Fallback>
+            <w:pict>
+              <v:shape w14:anchorId="4CF379DA" id="Entrada de lápiz 6" o:spid="_x0000_s1026" type="#_x0000_t75" style="position:absolute;margin-left:80.45pt;margin-top:33.75pt;width:83.2pt;height:68.95pt;z-index:251664384;visibility:visible;mso-wrap-style:square;mso-wrap-distance-left:9pt;mso-wrap-distance-top:0;mso-wrap-distance-right:9pt;mso-wrap-distance-bottom:0;mso-position-horizontal:absolute;mso-position-horizontal-relative:text;mso-position-vertical:absolute;mso-position-vertical-relative:text" o:gfxdata="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">
+                <v:imagedata r:id="rId12" o:title=""/>
+              </v:shape>
+            </w:pict>
+          </mc:Fallback>
+        </mc:AlternateContent>
+      </w:r>
+      <w:r>
+        <w:rPr>
+          <w:noProof/>
+        </w:rPr>
+        <mc:AlternateContent>
+          <mc:Choice Requires="wpi">
+            <w:drawing>
+              <wp:anchor distT="0" distB="0" distL="114300" distR="114300" simplePos="0" relativeHeight="251663360" behindDoc="0" locked="0" layoutInCell="1" allowOverlap="1" wp14:anchorId="5BC6B509" wp14:editId="274DEB8A">
+                <wp:simplePos x="0" y="0"/>
+                <wp:positionH relativeFrom="column">
+                  <wp:posOffset>629709</wp:posOffset>
+                </wp:positionH>
+                <wp:positionV relativeFrom="paragraph">
+                  <wp:posOffset>1432019</wp:posOffset>
+                </wp:positionV>
+                <wp:extent cx="444960" cy="577080"/>
+                <wp:effectExtent l="95250" t="152400" r="107950" b="147320"/>
+                <wp:wrapNone/>
+                <wp:docPr id="1824356911" name="Entrada de lápiz 5"/>
+                <wp:cNvGraphicFramePr/>
+                <a:graphic xmlns:a="http://schemas.openxmlformats.org/drawingml/2006/main">
+                  <a:graphicData uri="http://schemas.microsoft.com/office/word/2010/wordprocessingInk">
+                    <w14:contentPart bwMode="auto" r:id="rId13">
+                      <w14:nvContentPartPr>
+                        <w14:cNvContentPartPr/>
+                      </w14:nvContentPartPr>
+                      <w14:xfrm>
+                        <a:off x="0" y="0"/>
+                        <a:ext cx="444960" cy="577080"/>
+                      </w14:xfrm>
+                    </w14:contentPart>
+                  </a:graphicData>
+                </a:graphic>
+              </wp:anchor>
+            </w:drawing>
+          </mc:Choice>
+          <mc:Fallback>
+            <w:pict>
+              <v:shape w14:anchorId="70405DBF" id="Entrada de lápiz 5" o:spid="_x0000_s1026" type="#_x0000_t75" style="position:absolute;margin-left:45.4pt;margin-top:104.25pt;width:43.55pt;height:62.45pt;z-index:251663360;visibility:visible;mso-wrap-style:square;mso-wrap-distance-left:9pt;mso-wrap-distance-top:0;mso-wrap-distance-right:9pt;mso-wrap-distance-bottom:0;mso-position-horizontal:absolute;mso-position-horizontal-relative:text;mso-position-vertical:absolute;mso-position-vertical-relative:text" o:gfxdata="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">
+                <v:imagedata r:id="rId14" o:title=""/>
+              </v:shape>
+            </w:pict>
+          </mc:Fallback>
+        </mc:AlternateContent>
+      </w:r>
+      <w:r>
+        <w:rPr>
+          <w:noProof/>
+        </w:rPr>
+        <mc:AlternateContent>
+          <mc:Choice Requires="wpi">
+            <w:drawing>
+              <wp:anchor distT="0" distB="0" distL="114300" distR="114300" simplePos="0" relativeHeight="251662336" behindDoc="0" locked="0" layoutInCell="1" allowOverlap="1" wp14:anchorId="235C9BAB" wp14:editId="5FAC2F0F">
+                <wp:simplePos x="0" y="0"/>
+                <wp:positionH relativeFrom="column">
+                  <wp:posOffset>298509</wp:posOffset>
+                </wp:positionH>
+                <wp:positionV relativeFrom="paragraph">
+                  <wp:posOffset>1990379</wp:posOffset>
+                </wp:positionV>
+                <wp:extent cx="5012640" cy="64080"/>
+                <wp:effectExtent l="95250" t="152400" r="74295" b="165100"/>
+                <wp:wrapNone/>
+                <wp:docPr id="1825026026" name="Entrada de lápiz 4"/>
+                <wp:cNvGraphicFramePr/>
+                <a:graphic xmlns:a="http://schemas.openxmlformats.org/drawingml/2006/main">
+                  <a:graphicData uri="http://schemas.microsoft.com/office/word/2010/wordprocessingInk">
+                    <w14:contentPart bwMode="auto" r:id="rId15">
+                      <w14:nvContentPartPr>
+                        <w14:cNvContentPartPr/>
+                      </w14:nvContentPartPr>
+                      <w14:xfrm>
+                        <a:off x="0" y="0"/>
+                        <a:ext cx="5012640" cy="64080"/>
+                      </w14:xfrm>
+                    </w14:contentPart>
+                  </a:graphicData>
+                </a:graphic>
+              </wp:anchor>
+            </w:drawing>
+          </mc:Choice>
+          <mc:Fallback>
+            <w:pict>
+              <v:shape w14:anchorId="0E75860F" id="Entrada de lápiz 4" o:spid="_x0000_s1026" type="#_x0000_t75" style="position:absolute;margin-left:19.3pt;margin-top:148.2pt;width:403.2pt;height:22.1pt;z-index:251662336;visibility:visible;mso-wrap-style:square;mso-wrap-distance-left:9pt;mso-wrap-distance-top:0;mso-wrap-distance-right:9pt;mso-wrap-distance-bottom:0;mso-position-horizontal:absolute;mso-position-horizontal-relative:text;mso-position-vertical:absolute;mso-position-vertical-relative:text" o:gfxdata="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">
+                <v:imagedata r:id="rId16" o:title=""/>
+              </v:shape>
+            </w:pict>
+          </mc:Fallback>
+        </mc:AlternateContent>
+      </w:r>
+      <w:r>
+        <w:rPr>
+          <w:noProof/>
+        </w:rPr>
+        <mc:AlternateContent>
+          <mc:Choice Requires="wpi">
+            <w:drawing>
+              <wp:anchor distT="0" distB="0" distL="114300" distR="114300" simplePos="0" relativeHeight="251661312" behindDoc="0" locked="0" layoutInCell="1" allowOverlap="1" wp14:anchorId="1C547499" wp14:editId="61A0EE67">
+                <wp:simplePos x="0" y="0"/>
+                <wp:positionH relativeFrom="column">
+                  <wp:posOffset>638709</wp:posOffset>
+                </wp:positionH>
+                <wp:positionV relativeFrom="paragraph">
+                  <wp:posOffset>646139</wp:posOffset>
+                </wp:positionV>
+                <wp:extent cx="51840" cy="1521000"/>
+                <wp:effectExtent l="76200" t="152400" r="81915" b="155575"/>
+                <wp:wrapNone/>
+                <wp:docPr id="1810429067" name="Entrada de lápiz 3"/>
+                <wp:cNvGraphicFramePr/>
+                <a:graphic xmlns:a="http://schemas.openxmlformats.org/drawingml/2006/main">
+                  <a:graphicData uri="http://schemas.microsoft.com/office/word/2010/wordprocessingInk">
+                    <w14:contentPart bwMode="auto" r:id="rId17">
+                      <w14:nvContentPartPr>
+                        <w14:cNvContentPartPr/>
+                      </w14:nvContentPartPr>
+                      <w14:xfrm>
+                        <a:off x="0" y="0"/>
+                        <a:ext cx="51840" cy="1521000"/>
+                      </w14:xfrm>
+                    </w14:contentPart>
+                  </a:graphicData>
+                </a:graphic>
+              </wp:anchor>
+            </w:drawing>
+          </mc:Choice>
+          <mc:Fallback>
+            <w:pict>
+              <v:shape w14:anchorId="408B7A43" id="Entrada de lápiz 3" o:spid="_x0000_s1026" type="#_x0000_t75" style="position:absolute;margin-left:46.05pt;margin-top:42.4pt;width:12.6pt;height:136.75pt;z-index:251661312;visibility:visible;mso-wrap-style:square;mso-wrap-distance-left:9pt;mso-wrap-distance-top:0;mso-wrap-distance-right:9pt;mso-wrap-distance-bottom:0;mso-position-horizontal:absolute;mso-position-horizontal-relative:text;mso-position-vertical:absolute;mso-position-vertical-relative:text" o:gfxdata="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">
+                <v:imagedata r:id="rId18" o:title=""/>
+              </v:shape>
+            </w:pict>
+          </mc:Fallback>
+        </mc:AlternateContent>
+      </w:r>
+      <w:r>
+        <w:rPr>
+          <w:noProof/>
+        </w:rPr>
+        <mc:AlternateContent>
+          <mc:Choice Requires="wpi">
+            <w:drawing>
+              <wp:anchor distT="0" distB="0" distL="114300" distR="114300" simplePos="0" relativeHeight="251660288" behindDoc="0" locked="0" layoutInCell="1" allowOverlap="1" wp14:anchorId="24307091" wp14:editId="3C566E9A">
+                <wp:simplePos x="0" y="0"/>
+                <wp:positionH relativeFrom="column">
+                  <wp:posOffset>837429</wp:posOffset>
+                </wp:positionH>
+                <wp:positionV relativeFrom="paragraph">
+                  <wp:posOffset>1441739</wp:posOffset>
+                </wp:positionV>
+                <wp:extent cx="351360" cy="497160"/>
+                <wp:effectExtent l="95250" t="152400" r="125095" b="151130"/>
+                <wp:wrapNone/>
+                <wp:docPr id="625092861" name="Entrada de lápiz 2"/>
+                <wp:cNvGraphicFramePr/>
+                <a:graphic xmlns:a="http://schemas.openxmlformats.org/drawingml/2006/main">
+                  <a:graphicData uri="http://schemas.microsoft.com/office/word/2010/wordprocessingInk">
+                    <w14:contentPart bwMode="auto" r:id="rId19">
+                      <w14:nvContentPartPr>
+                        <w14:cNvContentPartPr/>
+                      </w14:nvContentPartPr>
+                      <w14:xfrm>
+                        <a:off x="0" y="0"/>
+                        <a:ext cx="351360" cy="497160"/>
+                      </w14:xfrm>
+                    </w14:contentPart>
+                  </a:graphicData>
+                </a:graphic>
+              </wp:anchor>
+            </w:drawing>
+          </mc:Choice>
+          <mc:Fallback>
+            <w:pict>
+              <v:shape w14:anchorId="29FA8376" id="Entrada de lápiz 2" o:spid="_x0000_s1026" type="#_x0000_t75" style="position:absolute;margin-left:61.7pt;margin-top:105pt;width:36.15pt;height:56.2pt;z-index:251660288;visibility:visible;mso-wrap-style:square;mso-wrap-distance-left:9pt;mso-wrap-distance-top:0;mso-wrap-distance-right:9pt;mso-wrap-distance-bottom:0;mso-position-horizontal:absolute;mso-position-horizontal-relative:text;mso-position-vertical:absolute;mso-position-vertical-relative:text" o:gfxdata="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">
+                <v:imagedata r:id="rId20" o:title=""/>
+              </v:shape>
+            </w:pict>
+          </mc:Fallback>
+        </mc:AlternateContent>
+      </w:r>
+      <w:r>
+        <w:rPr>
+          <w:noProof/>
+        </w:rPr>
+        <mc:AlternateContent>
+          <mc:Choice Requires="wpi">
+            <w:drawing>
+              <wp:anchor distT="0" distB="0" distL="114300" distR="114300" simplePos="0" relativeHeight="251659264" behindDoc="0" locked="0" layoutInCell="1" allowOverlap="1" wp14:anchorId="0DF2C8CB" wp14:editId="7F6D26EB">
+                <wp:simplePos x="0" y="0"/>
+                <wp:positionH relativeFrom="column">
+                  <wp:posOffset>2764509</wp:posOffset>
+                </wp:positionH>
+                <wp:positionV relativeFrom="paragraph">
+                  <wp:posOffset>1337699</wp:posOffset>
+                </wp:positionV>
+                <wp:extent cx="1426680" cy="654840"/>
+                <wp:effectExtent l="95250" t="152400" r="97790" b="164465"/>
+                <wp:wrapNone/>
+                <wp:docPr id="220613279" name="Entrada de lápiz 1"/>
+                <wp:cNvGraphicFramePr/>
+                <a:graphic xmlns:a="http://schemas.openxmlformats.org/drawingml/2006/main">
+                  <a:graphicData uri="http://schemas.microsoft.com/office/word/2010/wordprocessingInk">
+                    <w14:contentPart bwMode="auto" r:id="rId21">
+                      <w14:nvContentPartPr>
+                        <w14:cNvContentPartPr/>
+                      </w14:nvContentPartPr>
+                      <w14:xfrm>
+                        <a:off x="0" y="0"/>
+                        <a:ext cx="1426680" cy="654840"/>
+                      </w14:xfrm>
+                    </w14:contentPart>
+                  </a:graphicData>
+                </a:graphic>
+              </wp:anchor>
+            </w:drawing>
+          </mc:Choice>
+          <mc:Fallback>
+            <w:pict>
+              <v:shape w14:anchorId="1731F5B7" id="Entrada de lápiz 1" o:spid="_x0000_s1026" type="#_x0000_t75" style="position:absolute;margin-left:213.45pt;margin-top:96.85pt;width:120.85pt;height:68.55pt;z-index:251659264;visibility:visible;mso-wrap-style:square;mso-wrap-distance-left:9pt;mso-wrap-distance-top:0;mso-wrap-distance-right:9pt;mso-wrap-distance-bottom:0;mso-position-horizontal:absolute;mso-position-horizontal-relative:text;mso-position-vertical:absolute;mso-position-vertical-relative:text" o:gfxdata="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">
+                <v:imagedata r:id="rId22" o:title=""/>
+              </v:shape>
+            </w:pict>
+          </mc:Fallback>
+        </mc:AlternateContent>
+      </w:r>
+      <w:r>
+        <w:rPr>
+          <w:noProof/>
+        </w:rPr>
+        <w:drawing>
+          <wp:inline distT="0" distB="0" distL="0" distR="0" wp14:anchorId="48E03964" wp14:editId="55F130E2">
+            <wp:extent cx="5612130" cy="2610485"/>
+            <wp:effectExtent l="0" t="0" r="7620" b="0"/>
+            <wp:docPr id="141683641" name="Imagen 1"/>
+            <wp:cNvGraphicFramePr>
+              <a:graphicFrameLocks xmlns:a="http://schemas.openxmlformats.org/drawingml/2006/main" noChangeAspect="1"/>
+            </wp:cNvGraphicFramePr>
+            <a:graphic xmlns:a="http://schemas.openxmlformats.org/drawingml/2006/main">
+              <a:graphicData uri="http://schemas.openxmlformats.org/drawingml/2006/picture">
+                <pic:pic xmlns:pic="http://schemas.openxmlformats.org/drawingml/2006/picture">
+                  <pic:nvPicPr>
+                    <pic:cNvPr id="141683641" name=""/>
+                    <pic:cNvPicPr/>
+                  </pic:nvPicPr>
+                  <pic:blipFill>
+                    <a:blip r:embed="rId23"/>
+                    <a:stretch>
+                      <a:fillRect/>
+                    </a:stretch>
+                  </pic:blipFill>
+                  <pic:spPr>
+                    <a:xfrm>
+                      <a:off x="0" y="0"/>
+                      <a:ext cx="5612130" cy="2610485"/>
+                    </a:xfrm>
+                    <a:prstGeom prst="rect">
+                      <a:avLst/>
+                    </a:prstGeom>
+                  </pic:spPr>
+                </pic:pic>
+              </a:graphicData>
+            </a:graphic>
+          </wp:inline>
+        </w:drawing>
+      </w:r>
+    </w:p>
+    <w:p>
+      <w:r>
+        <w:rPr>
+          <w:noProof/>
+        </w:rPr>
+        <w:lastRenderedPageBreak/>
         <w:drawing>
           <wp:inline distT="0" distB="0" distL="0" distR="0" wp14:anchorId="78F6B08A" wp14:editId="2E628A89">
             <wp:extent cx="5612130" cy="2377440"/>
@@ -164,7 +541,7 @@
                     <pic:cNvPicPr/>
                   </pic:nvPicPr>
                   <pic:blipFill>
-                    <a:blip r:embed="rId9"/>
+                    <a:blip r:embed="rId24"/>
                     <a:stretch>
                       <a:fillRect/>
                     </a:stretch>
@@ -190,7 +567,6 @@
         <w:rPr>
           <w:noProof/>
         </w:rPr>
-        <w:lastRenderedPageBreak/>
         <w:drawing>
           <wp:inline distT="0" distB="0" distL="0" distR="0" wp14:anchorId="02E5C003" wp14:editId="0754483D">
             <wp:extent cx="5612130" cy="2218055"/>
@@ -207,7 +583,7 @@
                     <pic:cNvPicPr/>
                   </pic:nvPicPr>
                   <pic:blipFill>
-                    <a:blip r:embed="rId10"/>
+                    <a:blip r:embed="rId25"/>
                     <a:stretch>
                       <a:fillRect/>
                     </a:stretch>
@@ -249,7 +625,7 @@
                     <pic:cNvPicPr/>
                   </pic:nvPicPr>
                   <pic:blipFill>
-                    <a:blip r:embed="rId11"/>
+                    <a:blip r:embed="rId26"/>
                     <a:stretch>
                       <a:fillRect/>
                     </a:stretch>
@@ -275,6 +651,7 @@
         <w:rPr>
           <w:noProof/>
         </w:rPr>
+        <w:lastRenderedPageBreak/>
         <w:drawing>
           <wp:inline distT="0" distB="0" distL="0" distR="0" wp14:anchorId="78D84BDF" wp14:editId="54C12DF5">
             <wp:extent cx="5612130" cy="3435350"/>
@@ -291,7 +668,7 @@
                     <pic:cNvPicPr/>
                   </pic:nvPicPr>
                   <pic:blipFill>
-                    <a:blip r:embed="rId12"/>
+                    <a:blip r:embed="rId27"/>
                     <a:stretch>
                       <a:fillRect/>
                     </a:stretch>
@@ -318,6 +695,231 @@
           <w:noProof/>
         </w:rPr>
         <w:lastRenderedPageBreak/>
+        <mc:AlternateContent>
+          <mc:Choice Requires="wpi">
+            <w:drawing>
+              <wp:anchor distT="0" distB="0" distL="114300" distR="114300" simplePos="0" relativeHeight="251670528" behindDoc="0" locked="0" layoutInCell="1" allowOverlap="1" wp14:anchorId="7152C652" wp14:editId="33C09563">
+                <wp:simplePos x="0" y="0"/>
+                <wp:positionH relativeFrom="column">
+                  <wp:posOffset>1618269</wp:posOffset>
+                </wp:positionH>
+                <wp:positionV relativeFrom="paragraph">
+                  <wp:posOffset>3587936</wp:posOffset>
+                </wp:positionV>
+                <wp:extent cx="1060200" cy="25200"/>
+                <wp:effectExtent l="95250" t="152400" r="102235" b="146685"/>
+                <wp:wrapNone/>
+                <wp:docPr id="583478467" name="Entrada de lápiz 12"/>
+                <wp:cNvGraphicFramePr/>
+                <a:graphic xmlns:a="http://schemas.openxmlformats.org/drawingml/2006/main">
+                  <a:graphicData uri="http://schemas.microsoft.com/office/word/2010/wordprocessingInk">
+                    <w14:contentPart bwMode="auto" r:id="rId28">
+                      <w14:nvContentPartPr>
+                        <w14:cNvContentPartPr/>
+                      </w14:nvContentPartPr>
+                      <w14:xfrm>
+                        <a:off x="0" y="0"/>
+                        <a:ext cx="1060200" cy="25200"/>
+                      </w14:xfrm>
+                    </w14:contentPart>
+                  </a:graphicData>
+                </a:graphic>
+              </wp:anchor>
+            </w:drawing>
+          </mc:Choice>
+          <mc:Fallback>
+            <w:pict>
+              <v:shape w14:anchorId="40FCA038" id="Entrada de lápiz 12" o:spid="_x0000_s1026" type="#_x0000_t75" style="position:absolute;margin-left:123.2pt;margin-top:274pt;width:92pt;height:19pt;z-index:251670528;visibility:visible;mso-wrap-style:square;mso-wrap-distance-left:9pt;mso-wrap-distance-top:0;mso-wrap-distance-right:9pt;mso-wrap-distance-bottom:0;mso-position-horizontal:absolute;mso-position-horizontal-relative:text;mso-position-vertical:absolute;mso-position-vertical-relative:text" o:gfxdata="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">
+                <v:imagedata r:id="rId29" o:title=""/>
+              </v:shape>
+            </w:pict>
+          </mc:Fallback>
+        </mc:AlternateContent>
+      </w:r>
+      <w:r>
+        <w:rPr>
+          <w:noProof/>
+        </w:rPr>
+        <mc:AlternateContent>
+          <mc:Choice Requires="wpi">
+            <w:drawing>
+              <wp:anchor distT="0" distB="0" distL="114300" distR="114300" simplePos="0" relativeHeight="251669504" behindDoc="0" locked="0" layoutInCell="1" allowOverlap="1" wp14:anchorId="0E433A4B" wp14:editId="187E085E">
+                <wp:simplePos x="0" y="0"/>
+                <wp:positionH relativeFrom="column">
+                  <wp:posOffset>258909</wp:posOffset>
+                </wp:positionH>
+                <wp:positionV relativeFrom="paragraph">
+                  <wp:posOffset>3721496</wp:posOffset>
+                </wp:positionV>
+                <wp:extent cx="944640" cy="20160"/>
+                <wp:effectExtent l="95250" t="152400" r="103505" b="151765"/>
+                <wp:wrapNone/>
+                <wp:docPr id="98756399" name="Entrada de lápiz 11"/>
+                <wp:cNvGraphicFramePr/>
+                <a:graphic xmlns:a="http://schemas.openxmlformats.org/drawingml/2006/main">
+                  <a:graphicData uri="http://schemas.microsoft.com/office/word/2010/wordprocessingInk">
+                    <w14:contentPart bwMode="auto" r:id="rId30">
+                      <w14:nvContentPartPr>
+                        <w14:cNvContentPartPr/>
+                      </w14:nvContentPartPr>
+                      <w14:xfrm>
+                        <a:off x="0" y="0"/>
+                        <a:ext cx="944640" cy="20160"/>
+                      </w14:xfrm>
+                    </w14:contentPart>
+                  </a:graphicData>
+                </a:graphic>
+              </wp:anchor>
+            </w:drawing>
+          </mc:Choice>
+          <mc:Fallback>
+            <w:pict>
+              <v:shape w14:anchorId="6B575435" id="Entrada de lápiz 11" o:spid="_x0000_s1026" type="#_x0000_t75" style="position:absolute;margin-left:16.2pt;margin-top:284.55pt;width:82.9pt;height:18.6pt;z-index:251669504;visibility:visible;mso-wrap-style:square;mso-wrap-distance-left:9pt;mso-wrap-distance-top:0;mso-wrap-distance-right:9pt;mso-wrap-distance-bottom:0;mso-position-horizontal:absolute;mso-position-horizontal-relative:text;mso-position-vertical:absolute;mso-position-vertical-relative:text" o:gfxdata="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">
+                <v:imagedata r:id="rId31" o:title=""/>
+              </v:shape>
+            </w:pict>
+          </mc:Fallback>
+        </mc:AlternateContent>
+      </w:r>
+      <w:r>
+        <w:rPr>
+          <w:noProof/>
+        </w:rPr>
+        <mc:AlternateContent>
+          <mc:Choice Requires="wpi">
+            <w:drawing>
+              <wp:anchor distT="0" distB="0" distL="114300" distR="114300" simplePos="0" relativeHeight="251668480" behindDoc="0" locked="0" layoutInCell="1" allowOverlap="1" wp14:anchorId="270227D4" wp14:editId="49F4BA47">
+                <wp:simplePos x="0" y="0"/>
+                <wp:positionH relativeFrom="column">
+                  <wp:posOffset>2898789</wp:posOffset>
+                </wp:positionH>
+                <wp:positionV relativeFrom="paragraph">
+                  <wp:posOffset>3558416</wp:posOffset>
+                </wp:positionV>
+                <wp:extent cx="2584800" cy="30960"/>
+                <wp:effectExtent l="95250" t="152400" r="139700" b="160020"/>
+                <wp:wrapNone/>
+                <wp:docPr id="1696203325" name="Entrada de lápiz 10"/>
+                <wp:cNvGraphicFramePr/>
+                <a:graphic xmlns:a="http://schemas.openxmlformats.org/drawingml/2006/main">
+                  <a:graphicData uri="http://schemas.microsoft.com/office/word/2010/wordprocessingInk">
+                    <w14:contentPart bwMode="auto" r:id="rId32">
+                      <w14:nvContentPartPr>
+                        <w14:cNvContentPartPr/>
+                      </w14:nvContentPartPr>
+                      <w14:xfrm>
+                        <a:off x="0" y="0"/>
+                        <a:ext cx="2584800" cy="30960"/>
+                      </w14:xfrm>
+                    </w14:contentPart>
+                  </a:graphicData>
+                </a:graphic>
+              </wp:anchor>
+            </w:drawing>
+          </mc:Choice>
+          <mc:Fallback>
+            <w:pict>
+              <v:shape w14:anchorId="66A60832" id="Entrada de lápiz 10" o:spid="_x0000_s1026" type="#_x0000_t75" style="position:absolute;margin-left:224pt;margin-top:271.7pt;width:212.05pt;height:19.45pt;z-index:251668480;visibility:visible;mso-wrap-style:square;mso-wrap-distance-left:9pt;mso-wrap-distance-top:0;mso-wrap-distance-right:9pt;mso-wrap-distance-bottom:0;mso-position-horizontal:absolute;mso-position-horizontal-relative:text;mso-position-vertical:absolute;mso-position-vertical-relative:text" o:gfxdata="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">
+                <v:imagedata r:id="rId33" o:title=""/>
+              </v:shape>
+            </w:pict>
+          </mc:Fallback>
+        </mc:AlternateContent>
+      </w:r>
+      <w:r>
+        <w:rPr>
+          <w:noProof/>
+        </w:rPr>
+        <mc:AlternateContent>
+          <mc:Choice Requires="wpi">
+            <w:drawing>
+              <wp:anchor distT="0" distB="0" distL="114300" distR="114300" simplePos="0" relativeHeight="251667456" behindDoc="0" locked="0" layoutInCell="1" allowOverlap="1" wp14:anchorId="44F69276" wp14:editId="4AC10BA9">
+                <wp:simplePos x="0" y="0"/>
+                <wp:positionH relativeFrom="column">
+                  <wp:posOffset>1613589</wp:posOffset>
+                </wp:positionH>
+                <wp:positionV relativeFrom="paragraph">
+                  <wp:posOffset>2970176</wp:posOffset>
+                </wp:positionV>
+                <wp:extent cx="1037880" cy="15120"/>
+                <wp:effectExtent l="95250" t="152400" r="105410" b="156845"/>
+                <wp:wrapNone/>
+                <wp:docPr id="1339509177" name="Entrada de lápiz 9"/>
+                <wp:cNvGraphicFramePr/>
+                <a:graphic xmlns:a="http://schemas.openxmlformats.org/drawingml/2006/main">
+                  <a:graphicData uri="http://schemas.microsoft.com/office/word/2010/wordprocessingInk">
+                    <w14:contentPart bwMode="auto" r:id="rId34">
+                      <w14:nvContentPartPr>
+                        <w14:cNvContentPartPr/>
+                      </w14:nvContentPartPr>
+                      <w14:xfrm>
+                        <a:off x="0" y="0"/>
+                        <a:ext cx="1037880" cy="15120"/>
+                      </w14:xfrm>
+                    </w14:contentPart>
+                  </a:graphicData>
+                </a:graphic>
+              </wp:anchor>
+            </w:drawing>
+          </mc:Choice>
+          <mc:Fallback>
+            <w:pict>
+              <v:shape w14:anchorId="3BB9F532" id="Entrada de lápiz 9" o:spid="_x0000_s1026" type="#_x0000_t75" style="position:absolute;margin-left:122.8pt;margin-top:225.35pt;width:90.2pt;height:18.2pt;z-index:251667456;visibility:visible;mso-wrap-style:square;mso-wrap-distance-left:9pt;mso-wrap-distance-top:0;mso-wrap-distance-right:9pt;mso-wrap-distance-bottom:0;mso-position-horizontal:absolute;mso-position-horizontal-relative:text;mso-position-vertical:absolute;mso-position-vertical-relative:text" o:gfxdata="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">
+                <v:imagedata r:id="rId35" o:title=""/>
+              </v:shape>
+            </w:pict>
+          </mc:Fallback>
+        </mc:AlternateContent>
+      </w:r>
+      <w:r>
+        <w:rPr>
+          <w:noProof/>
+        </w:rPr>
+        <mc:AlternateContent>
+          <mc:Choice Requires="wpi">
+            <w:drawing>
+              <wp:anchor distT="0" distB="0" distL="114300" distR="114300" simplePos="0" relativeHeight="251666432" behindDoc="0" locked="0" layoutInCell="1" allowOverlap="1" wp14:anchorId="2E6E437B" wp14:editId="29C83D0E">
+                <wp:simplePos x="0" y="0"/>
+                <wp:positionH relativeFrom="column">
+                  <wp:posOffset>2913189</wp:posOffset>
+                </wp:positionH>
+                <wp:positionV relativeFrom="paragraph">
+                  <wp:posOffset>2969816</wp:posOffset>
+                </wp:positionV>
+                <wp:extent cx="2677680" cy="26280"/>
+                <wp:effectExtent l="0" t="152400" r="0" b="164465"/>
+                <wp:wrapNone/>
+                <wp:docPr id="1808991097" name="Entrada de lápiz 8"/>
+                <wp:cNvGraphicFramePr/>
+                <a:graphic xmlns:a="http://schemas.openxmlformats.org/drawingml/2006/main">
+                  <a:graphicData uri="http://schemas.microsoft.com/office/word/2010/wordprocessingInk">
+                    <w14:contentPart bwMode="auto" r:id="rId36">
+                      <w14:nvContentPartPr>
+                        <w14:cNvContentPartPr/>
+                      </w14:nvContentPartPr>
+                      <w14:xfrm>
+                        <a:off x="0" y="0"/>
+                        <a:ext cx="2677680" cy="26280"/>
+                      </w14:xfrm>
+                    </w14:contentPart>
+                  </a:graphicData>
+                </a:graphic>
+              </wp:anchor>
+            </w:drawing>
+          </mc:Choice>
+          <mc:Fallback>
+            <w:pict>
+              <v:shape w14:anchorId="26F157ED" id="Entrada de lápiz 8" o:spid="_x0000_s1026" type="#_x0000_t75" style="position:absolute;margin-left:225.2pt;margin-top:225.35pt;width:219.35pt;height:19.05pt;z-index:251666432;visibility:visible;mso-wrap-style:square;mso-wrap-distance-left:9pt;mso-wrap-distance-top:0;mso-wrap-distance-right:9pt;mso-wrap-distance-bottom:0;mso-position-horizontal:absolute;mso-position-horizontal-relative:text;mso-position-vertical:absolute;mso-position-vertical-relative:text" o:gfxdata="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">
+                <v:imagedata r:id="rId37" o:title=""/>
+              </v:shape>
+            </w:pict>
+          </mc:Fallback>
+        </mc:AlternateContent>
+      </w:r>
+      <w:r>
+        <w:rPr>
+          <w:noProof/>
+        </w:rPr>
         <w:drawing>
           <wp:inline distT="0" distB="0" distL="0" distR="0" wp14:anchorId="79E92B49" wp14:editId="60EA46CF">
             <wp:extent cx="5612130" cy="5791200"/>
@@ -334,7 +936,7 @@
                     <pic:cNvPicPr/>
                   </pic:nvPicPr>
                   <pic:blipFill>
-                    <a:blip r:embed="rId13"/>
+                    <a:blip r:embed="rId38"/>
                     <a:stretch>
                       <a:fillRect/>
                     </a:stretch>
@@ -578,7 +1180,7 @@
                     <pic:cNvPicPr/>
                   </pic:nvPicPr>
                   <pic:blipFill>
-                    <a:blip r:embed="rId14"/>
+                    <a:blip r:embed="rId39"/>
                     <a:stretch>
                       <a:fillRect/>
                     </a:stretch>
@@ -621,7 +1223,7 @@
                     <pic:cNvPicPr/>
                   </pic:nvPicPr>
                   <pic:blipFill>
-                    <a:blip r:embed="rId15"/>
+                    <a:blip r:embed="rId40"/>
                     <a:stretch>
                       <a:fillRect/>
                     </a:stretch>
@@ -663,7 +1265,7 @@
                     <pic:cNvPicPr/>
                   </pic:nvPicPr>
                   <pic:blipFill>
-                    <a:blip r:embed="rId16"/>
+                    <a:blip r:embed="rId41"/>
                     <a:stretch>
                       <a:fillRect/>
                     </a:stretch>
@@ -717,7 +1319,7 @@
                     <pic:cNvPicPr/>
                   </pic:nvPicPr>
                   <pic:blipFill>
-                    <a:blip r:embed="rId17"/>
+                    <a:blip r:embed="rId42"/>
                     <a:stretch>
                       <a:fillRect/>
                     </a:stretch>
@@ -769,7 +1371,7 @@
                     <pic:cNvPicPr/>
                   </pic:nvPicPr>
                   <pic:blipFill>
-                    <a:blip r:embed="rId18"/>
+                    <a:blip r:embed="rId43"/>
                     <a:stretch>
                       <a:fillRect/>
                     </a:stretch>
@@ -813,7 +1415,7 @@
                     <pic:cNvPicPr/>
                   </pic:nvPicPr>
                   <pic:blipFill>
-                    <a:blip r:embed="rId19"/>
+                    <a:blip r:embed="rId44"/>
                     <a:stretch>
                       <a:fillRect/>
                     </a:stretch>
@@ -856,7 +1458,7 @@
                     <pic:cNvPicPr/>
                   </pic:nvPicPr>
                   <pic:blipFill>
-                    <a:blip r:embed="rId20"/>
+                    <a:blip r:embed="rId45"/>
                     <a:stretch>
                       <a:fillRect/>
                     </a:stretch>
@@ -900,7 +1502,7 @@
                     <pic:cNvPicPr/>
                   </pic:nvPicPr>
                   <pic:blipFill>
-                    <a:blip r:embed="rId21"/>
+                    <a:blip r:embed="rId46"/>
                     <a:stretch>
                       <a:fillRect/>
                     </a:stretch>
@@ -943,7 +1545,7 @@
                     <pic:cNvPicPr/>
                   </pic:nvPicPr>
                   <pic:blipFill>
-                    <a:blip r:embed="rId22"/>
+                    <a:blip r:embed="rId47"/>
                     <a:stretch>
                       <a:fillRect/>
                     </a:stretch>
@@ -2203,6 +2805,354 @@
 </w:styles>
 </file>
 
+<file path=word/ink/ink1.xml><?xml version="1.0" encoding="utf-8"?>
+<inkml:ink xmlns:inkml="http://www.w3.org/2003/InkML">
+  <inkml:definitions>
+    <inkml:context xml:id="ctx0">
+      <inkml:inkSource xml:id="inkSrc0">
+        <inkml:traceFormat>
+          <inkml:channel name="X" type="integer" min="-2.14748E9" max="2.14748E9" units="cm"/>
+          <inkml:channel name="Y" type="integer" min="-2.14748E9" max="2.14748E9" units="cm"/>
+        </inkml:traceFormat>
+        <inkml:channelProperties>
+          <inkml:channelProperty channel="X" name="resolution" value="1000" units="1/cm"/>
+          <inkml:channelProperty channel="Y" name="resolution" value="1000" units="1/cm"/>
+        </inkml:channelProperties>
+      </inkml:inkSource>
+      <inkml:timestamp xml:id="ts0" timeString="2026-07-09T15:27:50.445"/>
+    </inkml:context>
+    <inkml:brush xml:id="br0">
+      <inkml:brushProperty name="width" value="0.3" units="cm"/>
+      <inkml:brushProperty name="height" value="0.6" units="cm"/>
+      <inkml:brushProperty name="color" value="#FFFC00"/>
+      <inkml:brushProperty name="tip" value="rectangle"/>
+      <inkml:brushProperty name="rasterOp" value="maskPen"/>
+      <inkml:brushProperty name="ignorePressure" value="1"/>
+    </inkml:brush>
+  </inkml:definitions>
+  <inkml:trace contextRef="#ctx0" brushRef="#br0">319 1,'-6'1,"0"0,1 1,-1-1,0 1,1 1,0-1,-1 1,1 0,0 0,0 1,-6 5,3-3,-14 11,1 2,0 0,2 1,0 1,2 1,0 0,1 2,2 0,0 0,1 1,2 1,-9 28,16-40,0 0,2 1,-1 0,2-1,0 1,0 0,2 0,2 19,1-14,0 1,2-1,0 0,2-1,12 25,16 27,61 89,-59-104,-8-10,47 54,-66-87,1-1,0-1,1 0,0 0,1-2,0 1,0-2,24 11,-26-15</inkml:trace>
+</inkml:ink>
+</file>
+
+<file path=word/ink/ink10.xml><?xml version="1.0" encoding="utf-8"?>
+<inkml:ink xmlns:inkml="http://www.w3.org/2003/InkML">
+  <inkml:definitions>
+    <inkml:context xml:id="ctx0">
+      <inkml:inkSource xml:id="inkSrc0">
+        <inkml:traceFormat>
+          <inkml:channel name="X" type="integer" min="-2.14748E9" max="2.14748E9" units="cm"/>
+          <inkml:channel name="Y" type="integer" min="-2.14748E9" max="2.14748E9" units="cm"/>
+        </inkml:traceFormat>
+        <inkml:channelProperties>
+          <inkml:channelProperty channel="X" name="resolution" value="1000" units="1/cm"/>
+          <inkml:channelProperty channel="Y" name="resolution" value="1000" units="1/cm"/>
+        </inkml:channelProperties>
+      </inkml:inkSource>
+      <inkml:timestamp xml:id="ts0" timeString="2026-07-09T15:34:30.274"/>
+    </inkml:context>
+    <inkml:brush xml:id="br0">
+      <inkml:brushProperty name="width" value="0.3" units="cm"/>
+      <inkml:brushProperty name="height" value="0.6" units="cm"/>
+      <inkml:brushProperty name="color" value="#FFFC00"/>
+      <inkml:brushProperty name="tip" value="rectangle"/>
+      <inkml:brushProperty name="rasterOp" value="maskPen"/>
+      <inkml:brushProperty name="ignorePressure" value="1"/>
+    </inkml:brush>
+  </inkml:definitions>
+  <inkml:trace contextRef="#ctx0" brushRef="#br0">0 1,'1748'0,"-1710"1,45 9,-3 0,70 0,220 23,-111-13,1-21,-89-1,3837 2,-3996 0</inkml:trace>
+</inkml:ink>
+</file>
+
+<file path=word/ink/ink11.xml><?xml version="1.0" encoding="utf-8"?>
+<inkml:ink xmlns:inkml="http://www.w3.org/2003/InkML">
+  <inkml:definitions>
+    <inkml:context xml:id="ctx0">
+      <inkml:inkSource xml:id="inkSrc0">
+        <inkml:traceFormat>
+          <inkml:channel name="X" type="integer" min="-2.14748E9" max="2.14748E9" units="cm"/>
+          <inkml:channel name="Y" type="integer" min="-2.14748E9" max="2.14748E9" units="cm"/>
+        </inkml:traceFormat>
+        <inkml:channelProperties>
+          <inkml:channelProperty channel="X" name="resolution" value="1000" units="1/cm"/>
+          <inkml:channelProperty channel="Y" name="resolution" value="1000" units="1/cm"/>
+        </inkml:channelProperties>
+      </inkml:inkSource>
+      <inkml:timestamp xml:id="ts0" timeString="2026-07-09T15:34:22.338"/>
+    </inkml:context>
+    <inkml:brush xml:id="br0">
+      <inkml:brushProperty name="width" value="0.3" units="cm"/>
+      <inkml:brushProperty name="height" value="0.6" units="cm"/>
+      <inkml:brushProperty name="color" value="#FFFC00"/>
+      <inkml:brushProperty name="tip" value="rectangle"/>
+      <inkml:brushProperty name="rasterOp" value="maskPen"/>
+      <inkml:brushProperty name="ignorePressure" value="1"/>
+    </inkml:brush>
+  </inkml:definitions>
+  <inkml:trace contextRef="#ctx0" brushRef="#br0">0 42,'100'-7,"-16"1,679 3,-406 5,-205-9,6 0,925 7,-1062-1,29-5,-28 3,26-1,-17 4,-18 0</inkml:trace>
+</inkml:ink>
+</file>
+
+<file path=word/ink/ink12.xml><?xml version="1.0" encoding="utf-8"?>
+<inkml:ink xmlns:inkml="http://www.w3.org/2003/InkML">
+  <inkml:definitions>
+    <inkml:context xml:id="ctx0">
+      <inkml:inkSource xml:id="inkSrc0">
+        <inkml:traceFormat>
+          <inkml:channel name="X" type="integer" min="-2.14748E9" max="2.14748E9" units="cm"/>
+          <inkml:channel name="Y" type="integer" min="-2.14748E9" max="2.14748E9" units="cm"/>
+        </inkml:traceFormat>
+        <inkml:channelProperties>
+          <inkml:channelProperty channel="X" name="resolution" value="1000" units="1/cm"/>
+          <inkml:channelProperty channel="Y" name="resolution" value="1000" units="1/cm"/>
+        </inkml:channelProperties>
+      </inkml:inkSource>
+      <inkml:timestamp xml:id="ts0" timeString="2026-07-09T15:34:17.550"/>
+    </inkml:context>
+    <inkml:brush xml:id="br0">
+      <inkml:brushProperty name="width" value="0.3" units="cm"/>
+      <inkml:brushProperty name="height" value="0.6" units="cm"/>
+      <inkml:brushProperty name="color" value="#FFFC00"/>
+      <inkml:brushProperty name="tip" value="rectangle"/>
+      <inkml:brushProperty name="rasterOp" value="maskPen"/>
+      <inkml:brushProperty name="ignorePressure" value="1"/>
+    </inkml:brush>
+  </inkml:definitions>
+  <inkml:trace contextRef="#ctx0" brushRef="#br0">1 43,'168'-7,"-18"0,57 8,97-3,-156-11,7 0,382 11,-274 4,391 5,5 0,-287 0,18-1,-335-6,275 2,0 20,-28-3,3-19,-115-2,1712 2,-1886 0</inkml:trace>
+</inkml:ink>
+</file>
+
+<file path=word/ink/ink2.xml><?xml version="1.0" encoding="utf-8"?>
+<inkml:ink xmlns:inkml="http://www.w3.org/2003/InkML">
+  <inkml:definitions>
+    <inkml:context xml:id="ctx0">
+      <inkml:inkSource xml:id="inkSrc0">
+        <inkml:traceFormat>
+          <inkml:channel name="X" type="integer" min="-2.14748E9" max="2.14748E9" units="cm"/>
+          <inkml:channel name="Y" type="integer" min="-2.14748E9" max="2.14748E9" units="cm"/>
+        </inkml:traceFormat>
+        <inkml:channelProperties>
+          <inkml:channelProperty channel="X" name="resolution" value="1000" units="1/cm"/>
+          <inkml:channelProperty channel="Y" name="resolution" value="1000" units="1/cm"/>
+        </inkml:channelProperties>
+      </inkml:inkSource>
+      <inkml:timestamp xml:id="ts0" timeString="2026-07-09T15:27:33.349"/>
+    </inkml:context>
+    <inkml:brush xml:id="br0">
+      <inkml:brushProperty name="width" value="0.3" units="cm"/>
+      <inkml:brushProperty name="height" value="0.6" units="cm"/>
+      <inkml:brushProperty name="color" value="#FFFC00"/>
+      <inkml:brushProperty name="tip" value="rectangle"/>
+      <inkml:brushProperty name="rasterOp" value="maskPen"/>
+      <inkml:brushProperty name="ignorePressure" value="1"/>
+    </inkml:brush>
+  </inkml:definitions>
+  <inkml:trace contextRef="#ctx0" brushRef="#br0">823 2,'-86'0,"-28"-2,-180 22,281-18,-1 0,1 2,0-1,0 2,0-1,-22 13,27-12,0 1,1-1,-1 1,1 1,0 0,1 0,0 0,0 0,0 1,-7 13,1 4,1 0,1 1,1 0,-8 36,-12 112,16-86,4-36,-12 92,20-125,1 0,0 0,1 0,1 0,8 30,20 103,-25-138,0 0,1 0,0-1,1 1,1-2,16 23,-1-8,43 42,-35-40,149 151,-168-166,1-1,1-1,0-1,1 0,0 0,0-2,1 0,21 9,53 31,-58-29,45 19,156 44,-181-70,0-2,90 8,282-12,-319-13,0-5,105-25,-186 31,0-1,0-1,0-1,-1-1,-1-1,1-1,31-22,-21 8,0-2,39-41,-56 51,-1-1,-1-1,-1 0,-1-1,19-39,44-135,-69 177,-1 0,-1-1,0 1,-2-1,0 0,-1 0,0 0,-2-1,-4-28,0 22,-1 0,-1 0,-1 1,-1 0,-2 0,-14-25,2 12,-49-63,-39-27,97 112,-8-10,-1 2,-2 0,0 2,-1 1,-1 1,-43-23,15 15,0 2,-2 2,0 3,-118-24,156 40,-83-14,-174-10,247 28,6-1,-44 4,64-2,1-1,-1 1,0 0,1 1,-1-1,1 1,-1-1,1 1,0-1,-1 1,1 0,0 0,0 0,0 1,1-1,-1 0,1 1,-1-1,1 1,0-1,-1 1,1 0,0 2,-3 9,0-1,1 1,-2 18,2 42,3-48</inkml:trace>
+</inkml:ink>
+</file>
+
+<file path=word/ink/ink3.xml><?xml version="1.0" encoding="utf-8"?>
+<inkml:ink xmlns:inkml="http://www.w3.org/2003/InkML">
+  <inkml:definitions>
+    <inkml:context xml:id="ctx0">
+      <inkml:inkSource xml:id="inkSrc0">
+        <inkml:traceFormat>
+          <inkml:channel name="X" type="integer" min="-2.14748E9" max="2.14748E9" units="cm"/>
+          <inkml:channel name="Y" type="integer" min="-2.14748E9" max="2.14748E9" units="cm"/>
+        </inkml:traceFormat>
+        <inkml:channelProperties>
+          <inkml:channelProperty channel="X" name="resolution" value="1000" units="1/cm"/>
+          <inkml:channelProperty channel="Y" name="resolution" value="1000" units="1/cm"/>
+        </inkml:channelProperties>
+      </inkml:inkSource>
+      <inkml:timestamp xml:id="ts0" timeString="2026-07-09T15:27:29.237"/>
+    </inkml:context>
+    <inkml:brush xml:id="br0">
+      <inkml:brushProperty name="width" value="0.3" units="cm"/>
+      <inkml:brushProperty name="height" value="0.6" units="cm"/>
+      <inkml:brushProperty name="color" value="#FFFC00"/>
+      <inkml:brushProperty name="tip" value="rectangle"/>
+      <inkml:brushProperty name="rasterOp" value="maskPen"/>
+      <inkml:brushProperty name="ignorePressure" value="1"/>
+    </inkml:brush>
+  </inkml:definitions>
+  <inkml:trace contextRef="#ctx0" brushRef="#br0">1 1,'52'-1,"80"4,-115-1,0 0,0 1,0 2,0-1,27 13,7 7,0 3,-2 1,-1 3,-2 2,51 46,-51-37,-2 1,-1 3,59 82,-94-115,205 320,-204-316,0 0,-1 1,-2 0,8 27,10 78,-15-69,0 37,-5-27,3 15,4 39,1-41,-10-59</inkml:trace>
+</inkml:ink>
+</file>
+
+<file path=word/ink/ink4.xml><?xml version="1.0" encoding="utf-8"?>
+<inkml:ink xmlns:inkml="http://www.w3.org/2003/InkML">
+  <inkml:definitions>
+    <inkml:context xml:id="ctx0">
+      <inkml:inkSource xml:id="inkSrc0">
+        <inkml:traceFormat>
+          <inkml:channel name="X" type="integer" min="-2.14748E9" max="2.14748E9" units="cm"/>
+          <inkml:channel name="Y" type="integer" min="-2.14748E9" max="2.14748E9" units="cm"/>
+        </inkml:traceFormat>
+        <inkml:channelProperties>
+          <inkml:channelProperty channel="X" name="resolution" value="1000" units="1/cm"/>
+          <inkml:channelProperty channel="Y" name="resolution" value="1000" units="1/cm"/>
+        </inkml:channelProperties>
+      </inkml:inkSource>
+      <inkml:timestamp xml:id="ts0" timeString="2026-07-09T15:27:27.658"/>
+    </inkml:context>
+    <inkml:brush xml:id="br0">
+      <inkml:brushProperty name="width" value="0.3" units="cm"/>
+      <inkml:brushProperty name="height" value="0.6" units="cm"/>
+      <inkml:brushProperty name="color" value="#FFFC00"/>
+      <inkml:brushProperty name="tip" value="rectangle"/>
+      <inkml:brushProperty name="rasterOp" value="maskPen"/>
+      <inkml:brushProperty name="ignorePressure" value="1"/>
+    </inkml:brush>
+  </inkml:definitions>
+  <inkml:trace contextRef="#ctx0" brushRef="#br0">1 1,'458'39,"-203"-10,873 23,-416-49,-147-1,-121 11,51 0,160-7,277 2,1582-9,-1959 8,183-2,-584-7,992-8,-489 11,917-3,-652-24,-904 25,-23 1</inkml:trace>
+</inkml:ink>
+</file>
+
+<file path=word/ink/ink5.xml><?xml version="1.0" encoding="utf-8"?>
+<inkml:ink xmlns:inkml="http://www.w3.org/2003/InkML">
+  <inkml:definitions>
+    <inkml:context xml:id="ctx0">
+      <inkml:inkSource xml:id="inkSrc0">
+        <inkml:traceFormat>
+          <inkml:channel name="X" type="integer" min="-2.14748E9" max="2.14748E9" units="cm"/>
+          <inkml:channel name="Y" type="integer" min="-2.14748E9" max="2.14748E9" units="cm"/>
+        </inkml:traceFormat>
+        <inkml:channelProperties>
+          <inkml:channelProperty channel="X" name="resolution" value="1000" units="1/cm"/>
+          <inkml:channelProperty channel="Y" name="resolution" value="1000" units="1/cm"/>
+        </inkml:channelProperties>
+      </inkml:inkSource>
+      <inkml:timestamp xml:id="ts0" timeString="2026-07-09T15:27:26.474"/>
+    </inkml:context>
+    <inkml:brush xml:id="br0">
+      <inkml:brushProperty name="width" value="0.3" units="cm"/>
+      <inkml:brushProperty name="height" value="0.6" units="cm"/>
+      <inkml:brushProperty name="color" value="#FFFC00"/>
+      <inkml:brushProperty name="tip" value="rectangle"/>
+      <inkml:brushProperty name="rasterOp" value="maskPen"/>
+      <inkml:brushProperty name="ignorePressure" value="1"/>
+    </inkml:brush>
+  </inkml:definitions>
+  <inkml:trace contextRef="#ctx0" brushRef="#br0">45 0,'2'1,"-1"-1,1 0,0 1,0-1,0 1,-1-1,1 1,0 0,0 0,-1 0,1 0,-1 0,1 0,-1 0,1 1,-1-1,0 0,3 4,16 30,-19-35,6 19,0-1,0 1,-2 0,0 0,-1 1,1 22,0 126,-5-121,-5 706,-32 2,-2-352,-7 102,29 4,19-346,3 146,22-2,-26-299,0-2,-1 1,1 0,1-1,-1 1,1-1,0 0,1 1,-1-1,1 0,5 7,2-3</inkml:trace>
+</inkml:ink>
+</file>
+
+<file path=word/ink/ink6.xml><?xml version="1.0" encoding="utf-8"?>
+<inkml:ink xmlns:inkml="http://www.w3.org/2003/InkML">
+  <inkml:definitions>
+    <inkml:context xml:id="ctx0">
+      <inkml:inkSource xml:id="inkSrc0">
+        <inkml:traceFormat>
+          <inkml:channel name="X" type="integer" min="-2.14748E9" max="2.14748E9" units="cm"/>
+          <inkml:channel name="Y" type="integer" min="-2.14748E9" max="2.14748E9" units="cm"/>
+        </inkml:traceFormat>
+        <inkml:channelProperties>
+          <inkml:channelProperty channel="X" name="resolution" value="1000" units="1/cm"/>
+          <inkml:channelProperty channel="Y" name="resolution" value="1000" units="1/cm"/>
+        </inkml:channelProperties>
+      </inkml:inkSource>
+      <inkml:timestamp xml:id="ts0" timeString="2026-07-09T15:27:24.914"/>
+    </inkml:context>
+    <inkml:brush xml:id="br0">
+      <inkml:brushProperty name="width" value="0.3" units="cm"/>
+      <inkml:brushProperty name="height" value="0.6" units="cm"/>
+      <inkml:brushProperty name="color" value="#FFFC00"/>
+      <inkml:brushProperty name="tip" value="rectangle"/>
+      <inkml:brushProperty name="rasterOp" value="maskPen"/>
+      <inkml:brushProperty name="ignorePressure" value="1"/>
+    </inkml:brush>
+  </inkml:definitions>
+  <inkml:trace contextRef="#ctx0" brushRef="#br0">0 1,'43'0,"-1"1,1 3,-1 1,0 2,0 2,51 18,-36-7,78 31,-108-40,-1 2,46 30,-49-24,0 0,34 40,-18-19,-23-21,-1 1,0 0,-2 1,-1 1,11 24,-21-43,10 23,-1 0,-2 1,0 1,4 30,-5-11,4 80,-12-117,-1 1,0-1,0 0,-1 1,0-1,-6 15,-29 57,24-53,3-10,-1 0,-1 0,-1-2,0 1,-1-1,-27 24,17-19,1 2,2 1,0 0,1 2,-31 56,48-75</inkml:trace>
+</inkml:ink>
+</file>
+
+<file path=word/ink/ink7.xml><?xml version="1.0" encoding="utf-8"?>
+<inkml:ink xmlns:inkml="http://www.w3.org/2003/InkML">
+  <inkml:definitions>
+    <inkml:context xml:id="ctx0">
+      <inkml:inkSource xml:id="inkSrc0">
+        <inkml:traceFormat>
+          <inkml:channel name="X" type="integer" min="-2.14748E9" max="2.14748E9" units="cm"/>
+          <inkml:channel name="Y" type="integer" min="-2.14748E9" max="2.14748E9" units="cm"/>
+        </inkml:traceFormat>
+        <inkml:channelProperties>
+          <inkml:channelProperty channel="X" name="resolution" value="1000" units="1/cm"/>
+          <inkml:channelProperty channel="Y" name="resolution" value="1000" units="1/cm"/>
+        </inkml:channelProperties>
+      </inkml:inkSource>
+      <inkml:timestamp xml:id="ts0" timeString="2026-07-09T15:27:08.706"/>
+    </inkml:context>
+    <inkml:brush xml:id="br0">
+      <inkml:brushProperty name="width" value="0.3" units="cm"/>
+      <inkml:brushProperty name="height" value="0.6" units="cm"/>
+      <inkml:brushProperty name="color" value="#FFFC00"/>
+      <inkml:brushProperty name="tip" value="rectangle"/>
+      <inkml:brushProperty name="rasterOp" value="maskPen"/>
+      <inkml:brushProperty name="ignorePressure" value="1"/>
+    </inkml:brush>
+  </inkml:definitions>
+  <inkml:trace contextRef="#ctx0" brushRef="#br0">771 468,'-40'-1,"-42"2,77 0,0 0,1 0,-1 1,1 0,-1 0,1 0,0 0,0 0,0 1,0 0,0 0,0 0,1 0,0 1,-1-1,-2 6,1-3,0 1,0 0,1 1,0-1,0 1,1 0,0 0,-3 11,3 4,1 0,1 0,4 38,-1-9,-2-29,1-1,9 44,-7-53,1-1,0 1,1-1,0 0,1 0,10 14,-5-10,1-1,0 0,1-1,1 0,0-1,1-1,0 0,1-1,28 14,64 49,-46-30,12 2,2-2,3-4,1-4,127 41,347 64,-499-128,803 132,-551-119,0-30,-277 2,1-2,-1-2,0 0,0-2,-1-1,0-2,49-25,-49 21,-15 9,0-2,-1 1,0-2,0 0,-1 0,14-14,-24 20,0 0,0 0,0 0,-1 0,1 0,-1 0,0-1,0 1,0 0,0-1,-1 1,1-1,-1 1,0-1,0 1,-1-7,-1-5,-1 1,-8-24,6 20,-18-68,11 37,-2 1,-37-86,8 43,-44-81,58 119,-42-57,-8-15,60 91,-1 0,-2 1,-44-49,40 57,-1 1,-1 1,-1 1,-1 2,0 1,-2 1,0 2,-1 1,-1 1,-50-12,-54-8,-227-28,-148 18,323 31,169 11,-719-49,-1 31,701 21,-54 7,78-5,0 0,0 1,0 1,1 0,-1 1,-14 9,26-13,0 0,1 1,-1-1,1 1,0 0,0 0,0 0,0 1,1-1,-1 1,1-1,0 1,0 0,0 0,0 0,1 0,-1 0,1 0,0 1,0 5,1-6,-1 0,2-1,-1 1,0 0,1-1,-1 1,1-1,0 1,0-1,0 1,1-1,-1 0,1 1,0-1,0 0,0 0,0 0,1 0,-1-1,1 1,0-1,-1 1,1-1,4 2,2 1,-1-1</inkml:trace>
+</inkml:ink>
+</file>
+
+<file path=word/ink/ink8.xml><?xml version="1.0" encoding="utf-8"?>
+<inkml:ink xmlns:inkml="http://www.w3.org/2003/InkML">
+  <inkml:definitions>
+    <inkml:context xml:id="ctx0">
+      <inkml:inkSource xml:id="inkSrc0">
+        <inkml:traceFormat>
+          <inkml:channel name="X" type="integer" min="-2.14748E9" max="2.14748E9" units="cm"/>
+          <inkml:channel name="Y" type="integer" min="-2.14748E9" max="2.14748E9" units="cm"/>
+        </inkml:traceFormat>
+        <inkml:channelProperties>
+          <inkml:channelProperty channel="X" name="resolution" value="1000" units="1/cm"/>
+          <inkml:channelProperty channel="Y" name="resolution" value="1000" units="1/cm"/>
+        </inkml:channelProperties>
+      </inkml:inkSource>
+      <inkml:timestamp xml:id="ts0" timeString="2026-07-09T15:34:32.858"/>
+    </inkml:context>
+    <inkml:brush xml:id="br0">
+      <inkml:brushProperty name="width" value="0.3" units="cm"/>
+      <inkml:brushProperty name="height" value="0.6" units="cm"/>
+      <inkml:brushProperty name="color" value="#FFFC00"/>
+      <inkml:brushProperty name="tip" value="rectangle"/>
+      <inkml:brushProperty name="rasterOp" value="maskPen"/>
+      <inkml:brushProperty name="ignorePressure" value="1"/>
+    </inkml:brush>
+  </inkml:definitions>
+  <inkml:trace contextRef="#ctx0" brushRef="#br0">1 0,'1162'16,"-783"1,362 7,-139-13,-567-10,-10 0</inkml:trace>
+</inkml:ink>
+</file>
+
+<file path=word/ink/ink9.xml><?xml version="1.0" encoding="utf-8"?>
+<inkml:ink xmlns:inkml="http://www.w3.org/2003/InkML">
+  <inkml:definitions>
+    <inkml:context xml:id="ctx0">
+      <inkml:inkSource xml:id="inkSrc0">
+        <inkml:traceFormat>
+          <inkml:channel name="X" type="integer" min="-2.14748E9" max="2.14748E9" units="cm"/>
+          <inkml:channel name="Y" type="integer" min="-2.14748E9" max="2.14748E9" units="cm"/>
+        </inkml:traceFormat>
+        <inkml:channelProperties>
+          <inkml:channelProperty channel="X" name="resolution" value="1000" units="1/cm"/>
+          <inkml:channelProperty channel="Y" name="resolution" value="1000" units="1/cm"/>
+        </inkml:channelProperties>
+      </inkml:inkSource>
+      <inkml:timestamp xml:id="ts0" timeString="2026-07-09T15:34:31.606"/>
+    </inkml:context>
+    <inkml:brush xml:id="br0">
+      <inkml:brushProperty name="width" value="0.3" units="cm"/>
+      <inkml:brushProperty name="height" value="0.6" units="cm"/>
+      <inkml:brushProperty name="color" value="#FFFC00"/>
+      <inkml:brushProperty name="tip" value="rectangle"/>
+      <inkml:brushProperty name="rasterOp" value="maskPen"/>
+      <inkml:brushProperty name="ignorePressure" value="1"/>
+    </inkml:brush>
+  </inkml:definitions>
+  <inkml:trace contextRef="#ctx0" brushRef="#br0">1 1,'1445'24,"-552"-6,-754-12,-5 1,-122-7</inkml:trace>
+</inkml:ink>
+</file>
+
 <file path=word/theme/theme1.xml><?xml version="1.0" encoding="utf-8"?>
 <a:theme xmlns:a="http://schemas.openxmlformats.org/drawingml/2006/main" name="Tema de Office">
   <a:themeElements>

</xml_diff>